<commit_message>
v2 stable: template fix, priloga loop, logo position
</commit_message>
<xml_diff>
--- a/public/assets/template_racun.docx
+++ b/public/assets/template_racun.docx
@@ -11,7 +11,7 @@
           <w:left w:w="70" w:type="dxa"/>
           <w:right w:w="70" w:type="dxa"/>
         </w:tblCellMar>
-        <w:tblLook w:val="04A0" w:firstRow="1" w:lastRow="0" w:firstColumn="1" w:lastColumn="0" w:noHBand="0" w:noVBand="1"/>
+        <w:tblLook w:val="0000" w:firstRow="0" w:lastRow="0" w:firstColumn="0" w:lastColumn="0" w:noHBand="0" w:noVBand="0"/>
       </w:tblPr>
       <w:tblGrid>
         <w:gridCol w:w="5400"/>
@@ -360,7 +360,7 @@
           <w:left w:w="70" w:type="dxa"/>
           <w:right w:w="70" w:type="dxa"/>
         </w:tblCellMar>
-        <w:tblLook w:val="04A0" w:firstRow="1" w:lastRow="0" w:firstColumn="1" w:lastColumn="0" w:noHBand="0" w:noVBand="1"/>
+        <w:tblLook w:val="0000" w:firstRow="0" w:lastRow="0" w:firstColumn="0" w:lastColumn="0" w:noHBand="0" w:noVBand="0"/>
       </w:tblPr>
       <w:tblGrid>
         <w:gridCol w:w="3686"/>
@@ -1717,7 +1717,7 @@
           <w:lang w:val="en-US" w:eastAsia="en-US"/>
         </w:rPr>
         <w:drawing>
-          <wp:anchor distT="0" distB="0" distL="114935" distR="114935" simplePos="0" relativeHeight="8" behindDoc="1" locked="0" layoutInCell="1" allowOverlap="1" wp14:anchorId="3A1E9F8D" wp14:editId="43DBA902">
+          <wp:anchor distT="0" distB="0" distL="114935" distR="114935" simplePos="0" relativeHeight="8" behindDoc="1" locked="0" layoutInCell="1" allowOverlap="1" wp14:anchorId="7C94540D" wp14:editId="6169708E">
             <wp:simplePos x="0" y="0"/>
             <wp:positionH relativeFrom="column">
               <wp:posOffset>166370</wp:posOffset>
@@ -1818,7 +1818,7 @@
           <w:left w:w="70" w:type="dxa"/>
           <w:right w:w="70" w:type="dxa"/>
         </w:tblCellMar>
-        <w:tblLook w:val="04A0" w:firstRow="1" w:lastRow="0" w:firstColumn="1" w:lastColumn="0" w:noHBand="0" w:noVBand="1"/>
+        <w:tblLook w:val="0000" w:firstRow="0" w:lastRow="0" w:firstColumn="0" w:lastColumn="0" w:noHBand="0" w:noVBand="0"/>
       </w:tblPr>
       <w:tblGrid>
         <w:gridCol w:w="1870"/>
@@ -2128,7 +2128,7 @@
                 <w:sz w:val="16"/>
                 <w:szCs w:val="16"/>
               </w:rPr>
-              <w:t>{delo}</w:t>
+              <w:t>{#priloga}{delo}</w:t>
             </w:r>
           </w:p>
         </w:tc>
@@ -2290,7 +2290,7 @@
                 <w:sz w:val="16"/>
                 <w:szCs w:val="16"/>
               </w:rPr>
-              <w:t>{opravil}</w:t>
+              <w:t>{opravil}{/priloga}</w:t>
             </w:r>
           </w:p>
         </w:tc>
@@ -2705,7 +2705,7 @@
         <w:lang w:val="en-US" w:eastAsia="en-US"/>
       </w:rPr>
       <w:drawing>
-        <wp:anchor distT="0" distB="0" distL="114935" distR="114935" simplePos="0" relativeHeight="7" behindDoc="1" locked="0" layoutInCell="1" allowOverlap="1" wp14:anchorId="1490A33B" wp14:editId="0BD2D997">
+        <wp:anchor distT="0" distB="0" distL="114935" distR="114935" simplePos="0" relativeHeight="7" behindDoc="1" locked="0" layoutInCell="1" allowOverlap="1" wp14:anchorId="3FA379FB" wp14:editId="7D8B5DEF">
           <wp:simplePos x="0" y="0"/>
           <wp:positionH relativeFrom="column">
             <wp:posOffset>-648335</wp:posOffset>
@@ -2789,7 +2789,7 @@
         <w:lang w:val="en-US" w:eastAsia="en-US"/>
       </w:rPr>
       <w:drawing>
-        <wp:anchor distT="0" distB="0" distL="114935" distR="114935" simplePos="0" relativeHeight="4" behindDoc="1" locked="0" layoutInCell="0" allowOverlap="1" wp14:anchorId="25CECD14" wp14:editId="099E2F7E">
+        <wp:anchor distT="0" distB="0" distL="114935" distR="114935" simplePos="0" relativeHeight="4" behindDoc="1" locked="0" layoutInCell="0" allowOverlap="1" wp14:anchorId="76BE3B1F" wp14:editId="7AEF0BC5">
           <wp:simplePos x="0" y="0"/>
           <wp:positionH relativeFrom="margin">
             <wp:posOffset>-290000</wp:posOffset>
@@ -2842,9 +2842,9 @@
 <file path=word/numbering.xml><?xml version="1.0" encoding="utf-8"?>
 <w:numbering xmlns:wpc="http://schemas.microsoft.com/office/word/2010/wordprocessingCanvas" xmlns:cx="http://schemas.microsoft.com/office/drawing/2014/chartex" xmlns:cx1="http://schemas.microsoft.com/office/drawing/2015/9/8/chartex" xmlns:cx2="http://schemas.microsoft.com/office/drawing/2015/10/21/chartex" xmlns:cx3="http://schemas.microsoft.com/office/drawing/2016/5/9/chartex" xmlns:cx4="http://schemas.microsoft.com/office/drawing/2016/5/10/chartex" xmlns:cx5="http://schemas.microsoft.com/office/drawing/2016/5/11/chartex" xmlns:cx6="http://schemas.microsoft.com/office/drawing/2016/5/12/chartex" xmlns:cx7="http://schemas.microsoft.com/office/drawing/2016/5/13/chartex" xmlns:cx8="http://schemas.microsoft.com/office/drawing/2016/5/14/chartex" xmlns:mc="http://schemas.openxmlformats.org/markup-compatibility/2006" xmlns:aink="http://schemas.microsoft.com/office/drawing/2016/ink" xmlns:am3d="http://schemas.microsoft.com/office/drawing/2017/model3d" xmlns:o="urn:schemas-microsoft-com:office:office" xmlns:oel="http://schemas.microsoft.com/office/2019/extlst" xmlns:r="http://schemas.openxmlformats.org/officeDocument/2006/relationships" xmlns:m="http://schemas.openxmlformats.org/officeDocument/2006/math" xmlns:v="urn:schemas-microsoft-com:vml" xmlns:wp14="http://schemas.microsoft.com/office/word/2010/wordprocessingDrawing" xmlns:wp="http://schemas.openxmlformats.org/drawingml/2006/wordprocessingDrawing" xmlns:w10="urn:schemas-microsoft-com:office:word" xmlns:w="http://schemas.openxmlformats.org/wordprocessingml/2006/main" xmlns:w14="http://schemas.microsoft.com/office/word/2010/wordml" xmlns:w15="http://schemas.microsoft.com/office/word/2012/wordml" xmlns:w16cex="http://schemas.microsoft.com/office/word/2018/wordml/cex" xmlns:w16cid="http://schemas.microsoft.com/office/word/2016/wordml/cid" xmlns:w16="http://schemas.microsoft.com/office/word/2018/wordml" xmlns:w16du="http://schemas.microsoft.com/office/word/2023/wordml/word16du" xmlns:w16sdtdh="http://schemas.microsoft.com/office/word/2020/wordml/sdtdatahash" xmlns:w16sdtfl="http://schemas.microsoft.com/office/word/2024/wordml/sdtformatlock" xmlns:w16se="http://schemas.microsoft.com/office/word/2015/wordml/symex" xmlns:wpg="http://schemas.microsoft.com/office/word/2010/wordprocessingGroup" xmlns:wpi="http://schemas.microsoft.com/office/word/2010/wordprocessingInk" xmlns:wne="http://schemas.microsoft.com/office/word/2006/wordml" xmlns:wps="http://schemas.microsoft.com/office/word/2010/wordprocessingShape" mc:Ignorable="w14 w15 w16se w16cid w16 w16cex w16sdtdh w16sdtfl w16du wp14">
   <w:abstractNum w:abstractNumId="0" w15:restartNumberingAfterBreak="0">
-    <w:nsid w:val="40886EBD"/>
+    <w:nsid w:val="438F0956"/>
     <w:multiLevelType w:val="multilevel"/>
-    <w:tmpl w:val="4852D41C"/>
+    <w:tmpl w:val="AE465BA6"/>
     <w:lvl w:ilvl="0">
       <w:start w:val="1"/>
       <w:numFmt w:val="decimal"/>
@@ -2963,7 +2963,7 @@
       </w:pPr>
     </w:lvl>
   </w:abstractNum>
-  <w:num w:numId="1" w16cid:durableId="1843930802">
+  <w:num w:numId="1" w16cid:durableId="1661687331">
     <w:abstractNumId w:val="0"/>
   </w:num>
 </w:numbering>

</xml_diff>

<commit_message>
feat: Dp vrstica v wordu, gostovanje postavka
- Template: injected conditional {#gostovanjeArr} and {#dpArr} rows
  after Di row in template_racun.docx
- Gostovanje: reads from register column J (gostovanj), pre-fills in
  metadata on client select, shows editable field in InvoiceSummary,
  included in skupajBrezDDV, renders as conditional row in Word
- Dp: renders as conditional row in Word (was previously calculated
  but never shown in the invoice table)
- Both rows hidden when value = 0 (empty array = docxtemplater hides row)

Co-Authored-By: Claude Sonnet 4.6 <noreply@anthropic.com>
</commit_message>
<xml_diff>
--- a/public/assets/template_racun.docx
+++ b/public/assets/template_racun.docx
@@ -1233,6 +1233,430 @@
                 <w:szCs w:val="18"/>
               </w:rPr>
               <w:t>{diZDDV}</w:t>
+            </w:r>
+          </w:p>
+        </w:tc>
+      </w:tr>
+      <w:tr>
+        <w:trPr>
+          <w:cantSplit/>
+        </w:trPr>
+        <w:tc>
+          <w:tcPr>
+            <w:tcW w:w="3686" w:type="dxa"/>
+            <w:tcBorders>
+              <w:bottom w:val="single" w:sz="4" w:space="0" w:color="000000"/>
+            </w:tcBorders>
+          </w:tcPr>
+          <w:p>
+            <w:pPr>
+              <w:rPr>
+                <w:rFonts w:ascii="Calibri" w:hAnsi="Calibri" w:cs="Calibri"/>
+                <w:sz w:val="18"/>
+                <w:szCs w:val="18"/>
+              </w:rPr>
+            </w:pPr>
+            <w:r>
+              <w:rPr>
+                <w:rFonts w:ascii="Calibri" w:hAnsi="Calibri" w:cs="Calibri"/>
+                <w:sz w:val="18"/>
+                <w:szCs w:val="18"/>
+              </w:rPr>
+              <w:t>{#gostovanjeArr}Gostovanje</w:t>
+            </w:r>
+          </w:p>
+        </w:tc>
+        <w:tc>
+          <w:tcPr>
+            <w:tcW w:w="632" w:type="dxa"/>
+            <w:tcBorders>
+              <w:bottom w:val="single" w:sz="4" w:space="0" w:color="000000"/>
+            </w:tcBorders>
+          </w:tcPr>
+          <w:p>
+            <w:pPr>
+              <w:jc w:val="right"/>
+              <w:rPr>
+                <w:rFonts w:ascii="Calibri" w:hAnsi="Calibri" w:cs="Calibri"/>
+                <w:sz w:val="18"/>
+                <w:szCs w:val="18"/>
+              </w:rPr>
+            </w:pPr>
+            <w:r>
+              <w:rPr>
+                <w:rFonts w:ascii="Calibri" w:hAnsi="Calibri" w:cs="Calibri"/>
+                <w:sz w:val="18"/>
+                <w:szCs w:val="18"/>
+              </w:rPr>
+              <w:t>1</w:t>
+            </w:r>
+          </w:p>
+        </w:tc>
+        <w:tc>
+          <w:tcPr>
+            <w:tcW w:w="654" w:type="dxa"/>
+            <w:tcBorders>
+              <w:bottom w:val="single" w:sz="4" w:space="0" w:color="000000"/>
+            </w:tcBorders>
+          </w:tcPr>
+          <w:p>
+            <w:pPr>
+              <w:jc w:val="right"/>
+              <w:rPr>
+                <w:rFonts w:ascii="Calibri" w:hAnsi="Calibri" w:cs="Calibri"/>
+                <w:sz w:val="18"/>
+                <w:szCs w:val="18"/>
+              </w:rPr>
+            </w:pPr>
+            <w:r>
+              <w:rPr>
+                <w:rFonts w:ascii="Calibri" w:hAnsi="Calibri" w:cs="Calibri"/>
+                <w:sz w:val="18"/>
+                <w:szCs w:val="18"/>
+              </w:rPr>
+              <w:t>kos</w:t>
+            </w:r>
+          </w:p>
+        </w:tc>
+        <w:tc>
+          <w:tcPr>
+            <w:tcW w:w="1220" w:type="dxa"/>
+            <w:tcBorders>
+              <w:bottom w:val="single" w:sz="4" w:space="0" w:color="000000"/>
+            </w:tcBorders>
+          </w:tcPr>
+          <w:p>
+            <w:pPr>
+              <w:jc w:val="right"/>
+              <w:rPr>
+                <w:rFonts w:ascii="Calibri" w:hAnsi="Calibri" w:cs="Calibri"/>
+                <w:sz w:val="18"/>
+                <w:szCs w:val="18"/>
+              </w:rPr>
+            </w:pPr>
+            <w:r>
+              <w:rPr>
+                <w:rFonts w:ascii="Calibri" w:hAnsi="Calibri" w:cs="Calibri"/>
+                <w:sz w:val="18"/>
+                <w:szCs w:val="18"/>
+              </w:rPr>
+              <w:t>{znesekGostovanja}</w:t>
+            </w:r>
+          </w:p>
+        </w:tc>
+        <w:tc>
+          <w:tcPr>
+            <w:tcW w:w="1372" w:type="dxa"/>
+            <w:tcBorders>
+              <w:bottom w:val="single" w:sz="4" w:space="0" w:color="000000"/>
+            </w:tcBorders>
+          </w:tcPr>
+          <w:p>
+            <w:pPr>
+              <w:jc w:val="right"/>
+              <w:rPr>
+                <w:rFonts w:ascii="Calibri" w:hAnsi="Calibri" w:cs="Calibri"/>
+                <w:sz w:val="18"/>
+                <w:szCs w:val="18"/>
+              </w:rPr>
+            </w:pPr>
+            <w:r>
+              <w:rPr>
+                <w:rFonts w:ascii="Calibri" w:hAnsi="Calibri" w:cs="Calibri"/>
+                <w:sz w:val="18"/>
+                <w:szCs w:val="18"/>
+              </w:rPr>
+              <w:t>{znesekGostovanja}</w:t>
+            </w:r>
+          </w:p>
+        </w:tc>
+        <w:tc>
+          <w:tcPr>
+            <w:tcW w:w="554" w:type="dxa"/>
+            <w:tcBorders>
+              <w:bottom w:val="single" w:sz="4" w:space="0" w:color="000000"/>
+            </w:tcBorders>
+          </w:tcPr>
+          <w:p>
+            <w:pPr>
+              <w:jc w:val="right"/>
+              <w:rPr>
+                <w:rFonts w:ascii="Calibri" w:hAnsi="Calibri" w:cs="Calibri"/>
+                <w:sz w:val="18"/>
+                <w:szCs w:val="18"/>
+              </w:rPr>
+            </w:pPr>
+            <w:r>
+              <w:rPr>
+                <w:rFonts w:ascii="Calibri" w:hAnsi="Calibri" w:cs="Calibri"/>
+                <w:sz w:val="18"/>
+                <w:szCs w:val="18"/>
+              </w:rPr>
+              <w:t>22</w:t>
+            </w:r>
+          </w:p>
+        </w:tc>
+        <w:tc>
+          <w:tcPr>
+            <w:tcW w:w="671" w:type="dxa"/>
+            <w:tcBorders>
+              <w:bottom w:val="single" w:sz="4" w:space="0" w:color="000000"/>
+            </w:tcBorders>
+          </w:tcPr>
+          <w:p>
+            <w:pPr>
+              <w:jc w:val="right"/>
+              <w:rPr>
+                <w:rFonts w:ascii="Calibri" w:hAnsi="Calibri" w:cs="Calibri"/>
+                <w:sz w:val="18"/>
+                <w:szCs w:val="18"/>
+              </w:rPr>
+            </w:pPr>
+            <w:r>
+              <w:rPr>
+                <w:rFonts w:ascii="Calibri" w:hAnsi="Calibri" w:cs="Calibri"/>
+                <w:sz w:val="18"/>
+                <w:szCs w:val="18"/>
+              </w:rPr>
+              <w:t>{ddvGostovanja}</w:t>
+            </w:r>
+          </w:p>
+        </w:tc>
+        <w:tc>
+          <w:tcPr>
+            <w:tcW w:w="1177" w:type="dxa"/>
+            <w:tcBorders>
+              <w:bottom w:val="single" w:sz="4" w:space="0" w:color="000000"/>
+            </w:tcBorders>
+          </w:tcPr>
+          <w:p>
+            <w:pPr>
+              <w:jc w:val="right"/>
+              <w:rPr>
+                <w:rFonts w:ascii="Calibri" w:hAnsi="Calibri" w:cs="Calibri"/>
+                <w:sz w:val="18"/>
+                <w:szCs w:val="18"/>
+              </w:rPr>
+            </w:pPr>
+            <w:r>
+              <w:rPr>
+                <w:rFonts w:ascii="Calibri" w:hAnsi="Calibri" w:cs="Calibri"/>
+                <w:sz w:val="18"/>
+                <w:szCs w:val="18"/>
+              </w:rPr>
+              <w:t>{gostovanjeZDDV}{/gostovanjeArr}</w:t>
+            </w:r>
+          </w:p>
+        </w:tc>
+      </w:tr>
+      <w:tr>
+        <w:trPr>
+          <w:cantSplit/>
+        </w:trPr>
+        <w:tc>
+          <w:tcPr>
+            <w:tcW w:w="3686" w:type="dxa"/>
+            <w:tcBorders>
+              <w:bottom w:val="single" w:sz="4" w:space="0" w:color="000000"/>
+            </w:tcBorders>
+          </w:tcPr>
+          <w:p>
+            <w:pPr>
+              <w:rPr>
+                <w:rFonts w:ascii="Calibri" w:hAnsi="Calibri" w:cs="Calibri"/>
+                <w:sz w:val="18"/>
+                <w:szCs w:val="18"/>
+              </w:rPr>
+            </w:pPr>
+            <w:r>
+              <w:rPr>
+                <w:rFonts w:ascii="Calibri" w:hAnsi="Calibri" w:cs="Calibri"/>
+                <w:sz w:val="18"/>
+                <w:szCs w:val="18"/>
+              </w:rPr>
+              <w:t>{#dpArr}Delo po ponudbi</w:t>
+            </w:r>
+          </w:p>
+        </w:tc>
+        <w:tc>
+          <w:tcPr>
+            <w:tcW w:w="632" w:type="dxa"/>
+            <w:tcBorders>
+              <w:bottom w:val="single" w:sz="4" w:space="0" w:color="000000"/>
+            </w:tcBorders>
+          </w:tcPr>
+          <w:p>
+            <w:pPr>
+              <w:jc w:val="right"/>
+              <w:rPr>
+                <w:rFonts w:ascii="Calibri" w:hAnsi="Calibri" w:cs="Calibri"/>
+                <w:sz w:val="18"/>
+                <w:szCs w:val="18"/>
+              </w:rPr>
+            </w:pPr>
+            <w:r>
+              <w:rPr>
+                <w:rFonts w:ascii="Calibri" w:hAnsi="Calibri" w:cs="Calibri"/>
+                <w:sz w:val="18"/>
+                <w:szCs w:val="18"/>
+              </w:rPr>
+              <w:t>1</w:t>
+            </w:r>
+          </w:p>
+        </w:tc>
+        <w:tc>
+          <w:tcPr>
+            <w:tcW w:w="654" w:type="dxa"/>
+            <w:tcBorders>
+              <w:bottom w:val="single" w:sz="4" w:space="0" w:color="000000"/>
+            </w:tcBorders>
+          </w:tcPr>
+          <w:p>
+            <w:pPr>
+              <w:jc w:val="right"/>
+              <w:rPr>
+                <w:rFonts w:ascii="Calibri" w:hAnsi="Calibri" w:cs="Calibri"/>
+                <w:sz w:val="18"/>
+                <w:szCs w:val="18"/>
+              </w:rPr>
+            </w:pPr>
+            <w:r>
+              <w:rPr>
+                <w:rFonts w:ascii="Calibri" w:hAnsi="Calibri" w:cs="Calibri"/>
+                <w:sz w:val="18"/>
+                <w:szCs w:val="18"/>
+              </w:rPr>
+              <w:t>kos</w:t>
+            </w:r>
+          </w:p>
+        </w:tc>
+        <w:tc>
+          <w:tcPr>
+            <w:tcW w:w="1220" w:type="dxa"/>
+            <w:tcBorders>
+              <w:bottom w:val="single" w:sz="4" w:space="0" w:color="000000"/>
+            </w:tcBorders>
+          </w:tcPr>
+          <w:p>
+            <w:pPr>
+              <w:jc w:val="right"/>
+              <w:rPr>
+                <w:rFonts w:ascii="Calibri" w:hAnsi="Calibri" w:cs="Calibri"/>
+                <w:sz w:val="18"/>
+                <w:szCs w:val="18"/>
+              </w:rPr>
+            </w:pPr>
+            <w:r>
+              <w:rPr>
+                <w:rFonts w:ascii="Calibri" w:hAnsi="Calibri" w:cs="Calibri"/>
+                <w:sz w:val="18"/>
+                <w:szCs w:val="18"/>
+              </w:rPr>
+              <w:t>{vrednostDp}</w:t>
+            </w:r>
+          </w:p>
+        </w:tc>
+        <w:tc>
+          <w:tcPr>
+            <w:tcW w:w="1372" w:type="dxa"/>
+            <w:tcBorders>
+              <w:bottom w:val="single" w:sz="4" w:space="0" w:color="000000"/>
+            </w:tcBorders>
+          </w:tcPr>
+          <w:p>
+            <w:pPr>
+              <w:jc w:val="right"/>
+              <w:rPr>
+                <w:rFonts w:ascii="Calibri" w:hAnsi="Calibri" w:cs="Calibri"/>
+                <w:sz w:val="18"/>
+                <w:szCs w:val="18"/>
+              </w:rPr>
+            </w:pPr>
+            <w:r>
+              <w:rPr>
+                <w:rFonts w:ascii="Calibri" w:hAnsi="Calibri" w:cs="Calibri"/>
+                <w:sz w:val="18"/>
+                <w:szCs w:val="18"/>
+              </w:rPr>
+              <w:t>{vrednostDp}</w:t>
+            </w:r>
+          </w:p>
+        </w:tc>
+        <w:tc>
+          <w:tcPr>
+            <w:tcW w:w="554" w:type="dxa"/>
+            <w:tcBorders>
+              <w:bottom w:val="single" w:sz="4" w:space="0" w:color="000000"/>
+            </w:tcBorders>
+          </w:tcPr>
+          <w:p>
+            <w:pPr>
+              <w:jc w:val="right"/>
+              <w:rPr>
+                <w:rFonts w:ascii="Calibri" w:hAnsi="Calibri" w:cs="Calibri"/>
+                <w:sz w:val="18"/>
+                <w:szCs w:val="18"/>
+              </w:rPr>
+            </w:pPr>
+            <w:r>
+              <w:rPr>
+                <w:rFonts w:ascii="Calibri" w:hAnsi="Calibri" w:cs="Calibri"/>
+                <w:sz w:val="18"/>
+                <w:szCs w:val="18"/>
+              </w:rPr>
+              <w:t>22</w:t>
+            </w:r>
+          </w:p>
+        </w:tc>
+        <w:tc>
+          <w:tcPr>
+            <w:tcW w:w="671" w:type="dxa"/>
+            <w:tcBorders>
+              <w:bottom w:val="single" w:sz="4" w:space="0" w:color="000000"/>
+            </w:tcBorders>
+          </w:tcPr>
+          <w:p>
+            <w:pPr>
+              <w:jc w:val="right"/>
+              <w:rPr>
+                <w:rFonts w:ascii="Calibri" w:hAnsi="Calibri" w:cs="Calibri"/>
+                <w:sz w:val="18"/>
+                <w:szCs w:val="18"/>
+              </w:rPr>
+            </w:pPr>
+            <w:r>
+              <w:rPr>
+                <w:rFonts w:ascii="Calibri" w:hAnsi="Calibri" w:cs="Calibri"/>
+                <w:sz w:val="18"/>
+                <w:szCs w:val="18"/>
+              </w:rPr>
+              <w:t>{ddvDp}</w:t>
+            </w:r>
+          </w:p>
+        </w:tc>
+        <w:tc>
+          <w:tcPr>
+            <w:tcW w:w="1177" w:type="dxa"/>
+            <w:tcBorders>
+              <w:bottom w:val="single" w:sz="4" w:space="0" w:color="000000"/>
+            </w:tcBorders>
+          </w:tcPr>
+          <w:p>
+            <w:pPr>
+              <w:jc w:val="right"/>
+              <w:rPr>
+                <w:rFonts w:ascii="Calibri" w:hAnsi="Calibri" w:cs="Calibri"/>
+                <w:sz w:val="18"/>
+                <w:szCs w:val="18"/>
+              </w:rPr>
+            </w:pPr>
+            <w:r>
+              <w:rPr>
+                <w:rFonts w:ascii="Calibri" w:hAnsi="Calibri" w:cs="Calibri"/>
+                <w:sz w:val="18"/>
+                <w:szCs w:val="18"/>
+              </w:rPr>
+              <w:t>{dpZDDV}{/dpArr}</w:t>
             </w:r>
           </w:p>
         </w:tc>

</xml_diff>

<commit_message>
fix: skrij prazne postavke z 0 EUR
</commit_message>
<xml_diff>
--- a/public/assets/template_racun.docx
+++ b/public/assets/template_racun.docx
@@ -1,5 +1,52 @@
 
-<file path=word/document.xml><?xml version="1.0" encoding="utf-8"?>
+<file path=docProps\app.xml><?xml version="1.0" encoding="utf-8"?>
+<Properties xmlns="http://schemas.openxmlformats.org/officeDocument/2006/extended-properties" xmlns:vt="http://schemas.openxmlformats.org/officeDocument/2006/docPropsVTypes">
+  <Template>Normal</Template>
+  <TotalTime>0</TotalTime>
+  <Pages>2</Pages>
+  <Words>177</Words>
+  <Characters>1013</Characters>
+  <Application>Microsoft Office Word</Application>
+  <DocSecurity>0</DocSecurity>
+  <Lines>8</Lines>
+  <Paragraphs>2</Paragraphs>
+  <ScaleCrop>false</ScaleCrop>
+  <Company/>
+  <LinksUpToDate>false</LinksUpToDate>
+  <CharactersWithSpaces>1188</CharactersWithSpaces>
+  <SharedDoc>false</SharedDoc>
+  <HyperlinksChanged>false</HyperlinksChanged>
+  <AppVersion>16.0000</AppVersion>
+</Properties>
+</file>
+
+<file path=docProps\core.xml><?xml version="1.0" encoding="utf-8"?>
+<cp:coreProperties xmlns:cp="http://schemas.openxmlformats.org/package/2006/metadata/core-properties" xmlns:dc="http://purl.org/dc/elements/1.1/" xmlns:dcterms="http://purl.org/dc/terms/" xmlns:dcmitype="http://purl.org/dc/dcmitype/" xmlns:xsi="http://www.w3.org/2001/XMLSchema-instance">
+  <dc:creator>Klemen Kladnik</dc:creator>
+  <cp:lastModifiedBy>Klemen Kladnik</cp:lastModifiedBy>
+  <cp:revision>2</cp:revision>
+  <dcterms:created xsi:type="dcterms:W3CDTF">2026-06-01T18:23:00Z</dcterms:created>
+  <dcterms:modified xsi:type="dcterms:W3CDTF">2026-06-01T18:23:00Z</dcterms:modified>
+</cp:coreProperties>
+</file>
+
+<file path=docProps\core0.xml><?xml version="1.0" encoding="utf-8"?>
+<cp:coreProperties xmlns:cp="http://schemas.openxmlformats.org/package/2006/metadata/core-properties" xmlns:dc="http://purl.org/dc/elements/1.1/" xmlns:dcterms="http://purl.org/dc/terms/" xmlns:dcmitype="http://purl.org/dc/dcmitype/" xmlns:xsi="http://www.w3.org/2001/XMLSchema-instance">
+  <dcterms:created xsi:type="dcterms:W3CDTF">2026-05-04T08:03:00Z</dcterms:created>
+  <dc:creator>Zornada</dc:creator>
+  <dc:description/>
+  <cp:keywords/>
+  <dc:language>en-US</dc:language>
+  <cp:lastModifiedBy>Mojca Zornada</cp:lastModifiedBy>
+  <cp:lastPrinted>2026-03-05T09:25:00Z</cp:lastPrinted>
+  <dcterms:modified xsi:type="dcterms:W3CDTF">2026-05-05T09:43:00Z</dcterms:modified>
+  <cp:revision>5</cp:revision>
+  <dc:subject/>
+  <dc:title>TALPA, Leo Zornada s</dc:title>
+</cp:coreProperties>
+</file>
+
+<file path=word\document.xml><?xml version="1.0" encoding="utf-8"?>
 <w:document xmlns:wpc="http://schemas.microsoft.com/office/word/2010/wordprocessingCanvas" xmlns:cx="http://schemas.microsoft.com/office/drawing/2014/chartex" xmlns:cx1="http://schemas.microsoft.com/office/drawing/2015/9/8/chartex" xmlns:cx2="http://schemas.microsoft.com/office/drawing/2015/10/21/chartex" xmlns:cx3="http://schemas.microsoft.com/office/drawing/2016/5/9/chartex" xmlns:cx4="http://schemas.microsoft.com/office/drawing/2016/5/10/chartex" xmlns:cx5="http://schemas.microsoft.com/office/drawing/2016/5/11/chartex" xmlns:cx6="http://schemas.microsoft.com/office/drawing/2016/5/12/chartex" xmlns:cx7="http://schemas.microsoft.com/office/drawing/2016/5/13/chartex" xmlns:cx8="http://schemas.microsoft.com/office/drawing/2016/5/14/chartex" xmlns:mc="http://schemas.openxmlformats.org/markup-compatibility/2006" xmlns:aink="http://schemas.microsoft.com/office/drawing/2016/ink" xmlns:am3d="http://schemas.microsoft.com/office/drawing/2017/model3d" xmlns:o="urn:schemas-microsoft-com:office:office" xmlns:oel="http://schemas.microsoft.com/office/2019/extlst" xmlns:r="http://schemas.openxmlformats.org/officeDocument/2006/relationships" xmlns:m="http://schemas.openxmlformats.org/officeDocument/2006/math" xmlns:v="urn:schemas-microsoft-com:vml" xmlns:wp14="http://schemas.microsoft.com/office/word/2010/wordprocessingDrawing" xmlns:wp="http://schemas.openxmlformats.org/drawingml/2006/wordprocessingDrawing" xmlns:w10="urn:schemas-microsoft-com:office:word" xmlns:w="http://schemas.openxmlformats.org/wordprocessingml/2006/main" xmlns:w14="http://schemas.microsoft.com/office/word/2010/wordml" xmlns:w15="http://schemas.microsoft.com/office/word/2012/wordml" xmlns:w16cex="http://schemas.microsoft.com/office/word/2018/wordml/cex" xmlns:w16cid="http://schemas.microsoft.com/office/word/2016/wordml/cid" xmlns:w16="http://schemas.microsoft.com/office/word/2018/wordml" xmlns:w16du="http://schemas.microsoft.com/office/word/2023/wordml/word16du" xmlns:w16sdtdh="http://schemas.microsoft.com/office/word/2020/wordml/sdtdatahash" xmlns:w16sdtfl="http://schemas.microsoft.com/office/word/2024/wordml/sdtformatlock" xmlns:w16se="http://schemas.microsoft.com/office/word/2015/wordml/symex" xmlns:wpg="http://schemas.microsoft.com/office/word/2010/wordprocessingGroup" xmlns:wpi="http://schemas.microsoft.com/office/word/2010/wordprocessingInk" xmlns:wne="http://schemas.microsoft.com/office/word/2006/wordml" xmlns:wps="http://schemas.microsoft.com/office/word/2010/wordprocessingShape" mc:Ignorable="w14 w15 w16se w16cid w16 w16cex w16sdtdh w16sdtfl w16du wp14">
   <w:body>
     <w:tbl>
@@ -628,7 +675,7 @@
                 <w:sz w:val="18"/>
                 <w:szCs w:val="18"/>
               </w:rPr>
-              <w:t>{opisVzdrzevanja}</w:t>
+              <w:t>{#vzdrzevanjeArr}{opisVzdrzevanja}</w:t>
             </w:r>
           </w:p>
         </w:tc>
@@ -800,7 +847,7 @@
                 <w:sz w:val="18"/>
                 <w:szCs w:val="18"/>
               </w:rPr>
-              <w:t>{vzdrzevanjeZDDV}</w:t>
+              <w:t>{vzdrzevanjeZDDV}{/vzdrzevanjeArr}</w:t>
             </w:r>
           </w:p>
         </w:tc>
@@ -830,7 +877,7 @@
                 <w:sz w:val="18"/>
                 <w:szCs w:val="18"/>
               </w:rPr>
-              <w:t>Delo tehnik</w:t>
+              <w:t>{#dtArr}Delo tehnik</w:t>
             </w:r>
           </w:p>
         </w:tc>
@@ -1016,7 +1063,7 @@
                 <w:sz w:val="18"/>
                 <w:szCs w:val="18"/>
               </w:rPr>
-              <w:t>{dtZDDV}</w:t>
+              <w:t>{dtZDDV}{/dtArr}</w:t>
             </w:r>
           </w:p>
         </w:tc>
@@ -1046,7 +1093,7 @@
                 <w:sz w:val="18"/>
                 <w:szCs w:val="18"/>
               </w:rPr>
-              <w:t>Delo inženir</w:t>
+              <w:t>{#diArr}Delo inženir</w:t>
             </w:r>
           </w:p>
         </w:tc>
@@ -1232,7 +1279,7 @@
                 <w:sz w:val="18"/>
                 <w:szCs w:val="18"/>
               </w:rPr>
-              <w:t>{diZDDV}</w:t>
+              <w:t>{diZDDV}{/diArr}</w:t>
             </w:r>
           </w:p>
         </w:tc>
@@ -3094,7 +3141,7 @@
 </w:document>
 </file>
 
-<file path=word/endnotes.xml><?xml version="1.0" encoding="utf-8"?>
+<file path=word\endnotes.xml><?xml version="1.0" encoding="utf-8"?>
 <w:endnotes xmlns:wpc="http://schemas.microsoft.com/office/word/2010/wordprocessingCanvas" xmlns:cx="http://schemas.microsoft.com/office/drawing/2014/chartex" xmlns:cx1="http://schemas.microsoft.com/office/drawing/2015/9/8/chartex" xmlns:cx2="http://schemas.microsoft.com/office/drawing/2015/10/21/chartex" xmlns:cx3="http://schemas.microsoft.com/office/drawing/2016/5/9/chartex" xmlns:cx4="http://schemas.microsoft.com/office/drawing/2016/5/10/chartex" xmlns:cx5="http://schemas.microsoft.com/office/drawing/2016/5/11/chartex" xmlns:cx6="http://schemas.microsoft.com/office/drawing/2016/5/12/chartex" xmlns:cx7="http://schemas.microsoft.com/office/drawing/2016/5/13/chartex" xmlns:cx8="http://schemas.microsoft.com/office/drawing/2016/5/14/chartex" xmlns:mc="http://schemas.openxmlformats.org/markup-compatibility/2006" xmlns:aink="http://schemas.microsoft.com/office/drawing/2016/ink" xmlns:am3d="http://schemas.microsoft.com/office/drawing/2017/model3d" xmlns:o="urn:schemas-microsoft-com:office:office" xmlns:oel="http://schemas.microsoft.com/office/2019/extlst" xmlns:r="http://schemas.openxmlformats.org/officeDocument/2006/relationships" xmlns:m="http://schemas.openxmlformats.org/officeDocument/2006/math" xmlns:v="urn:schemas-microsoft-com:vml" xmlns:wp14="http://schemas.microsoft.com/office/word/2010/wordprocessingDrawing" xmlns:wp="http://schemas.openxmlformats.org/drawingml/2006/wordprocessingDrawing" xmlns:w10="urn:schemas-microsoft-com:office:word" xmlns:w="http://schemas.openxmlformats.org/wordprocessingml/2006/main" xmlns:w14="http://schemas.microsoft.com/office/word/2010/wordml" xmlns:w15="http://schemas.microsoft.com/office/word/2012/wordml" xmlns:w16cex="http://schemas.microsoft.com/office/word/2018/wordml/cex" xmlns:w16cid="http://schemas.microsoft.com/office/word/2016/wordml/cid" xmlns:w16="http://schemas.microsoft.com/office/word/2018/wordml" xmlns:w16du="http://schemas.microsoft.com/office/word/2023/wordml/word16du" xmlns:w16sdtdh="http://schemas.microsoft.com/office/word/2020/wordml/sdtdatahash" xmlns:w16sdtfl="http://schemas.microsoft.com/office/word/2024/wordml/sdtformatlock" xmlns:w16se="http://schemas.microsoft.com/office/word/2015/wordml/symex" xmlns:wpg="http://schemas.microsoft.com/office/word/2010/wordprocessingGroup" xmlns:wpi="http://schemas.microsoft.com/office/word/2010/wordprocessingInk" xmlns:wne="http://schemas.microsoft.com/office/word/2006/wordml" xmlns:wps="http://schemas.microsoft.com/office/word/2010/wordprocessingShape" mc:Ignorable="w14 w15 w16se w16cid w16 w16cex w16sdtdh w16sdtfl w16du wp14">
   <w:endnote w:type="separator" w:id="-1">
     <w:p>
@@ -3113,7 +3160,94 @@
 </w:endnotes>
 </file>
 
-<file path=word/footer1.xml><?xml version="1.0" encoding="utf-8"?>
+<file path=word\fontTable.xml><?xml version="1.0" encoding="utf-8"?>
+<w:fonts xmlns:mc="http://schemas.openxmlformats.org/markup-compatibility/2006" xmlns:r="http://schemas.openxmlformats.org/officeDocument/2006/relationships" xmlns:w="http://schemas.openxmlformats.org/wordprocessingml/2006/main" xmlns:w14="http://schemas.microsoft.com/office/word/2010/wordml" xmlns:w15="http://schemas.microsoft.com/office/word/2012/wordml" xmlns:w16cex="http://schemas.microsoft.com/office/word/2018/wordml/cex" xmlns:w16cid="http://schemas.microsoft.com/office/word/2016/wordml/cid" xmlns:w16="http://schemas.microsoft.com/office/word/2018/wordml" xmlns:w16du="http://schemas.microsoft.com/office/word/2023/wordml/word16du" xmlns:w16sdtdh="http://schemas.microsoft.com/office/word/2020/wordml/sdtdatahash" xmlns:w16sdtfl="http://schemas.microsoft.com/office/word/2024/wordml/sdtformatlock" xmlns:w16se="http://schemas.microsoft.com/office/word/2015/wordml/symex" mc:Ignorable="w14 w15 w16se w16cid w16 w16cex w16sdtdh w16sdtfl w16du">
+  <w:font w:name="Liberation Serif">
+    <w:altName w:val="Times New Roman"/>
+    <w:charset w:val="00"/>
+    <w:family w:val="roman"/>
+    <w:pitch w:val="variable"/>
+  </w:font>
+  <w:font w:name="Noto Serif CJK SC">
+    <w:panose1 w:val="00000000000000000000"/>
+    <w:charset w:val="00"/>
+    <w:family w:val="roman"/>
+    <w:notTrueType/>
+    <w:pitch w:val="default"/>
+  </w:font>
+  <w:font w:name="FreeSans">
+    <w:panose1 w:val="00000000000000000000"/>
+    <w:charset w:val="00"/>
+    <w:family w:val="roman"/>
+    <w:notTrueType/>
+    <w:pitch w:val="default"/>
+  </w:font>
+  <w:font w:name="Times New Roman">
+    <w:panose1 w:val="02020603050405020304"/>
+    <w:charset w:val="00"/>
+    <w:family w:val="roman"/>
+    <w:pitch w:val="variable"/>
+    <w:sig w:usb0="E0002EFF" w:usb1="C000785B" w:usb2="00000009" w:usb3="00000000" w:csb0="000001FF" w:csb1="00000000"/>
+  </w:font>
+  <w:font w:name="Arial">
+    <w:panose1 w:val="020B0604020202020204"/>
+    <w:charset w:val="00"/>
+    <w:family w:val="swiss"/>
+    <w:pitch w:val="variable"/>
+    <w:sig w:usb0="E0002EFF" w:usb1="C000785B" w:usb2="00000009" w:usb3="00000000" w:csb0="000001FF" w:csb1="00000000"/>
+  </w:font>
+  <w:font w:name="Calibri">
+    <w:panose1 w:val="020F0502020204030204"/>
+    <w:charset w:val="EE"/>
+    <w:family w:val="swiss"/>
+    <w:pitch w:val="variable"/>
+    <w:sig w:usb0="E4002EFF" w:usb1="C200247B" w:usb2="00000009" w:usb3="00000000" w:csb0="000001FF" w:csb1="00000000"/>
+  </w:font>
+  <w:font w:name="Courier New">
+    <w:panose1 w:val="02070309020205020404"/>
+    <w:charset w:val="00"/>
+    <w:family w:val="modern"/>
+    <w:pitch w:val="fixed"/>
+    <w:sig w:usb0="E0002EFF" w:usb1="C0007843" w:usb2="00000009" w:usb3="00000000" w:csb0="000001FF" w:csb1="00000000"/>
+  </w:font>
+  <w:font w:name="Wingdings">
+    <w:panose1 w:val="05000000000000000000"/>
+    <w:charset w:val="02"/>
+    <w:family w:val="auto"/>
+    <w:pitch w:val="variable"/>
+    <w:sig w:usb0="00000000" w:usb1="10000000" w:usb2="00000000" w:usb3="00000000" w:csb0="80000000" w:csb1="00000000"/>
+  </w:font>
+  <w:font w:name="Symbol">
+    <w:panose1 w:val="05050102010706020507"/>
+    <w:charset w:val="02"/>
+    <w:family w:val="roman"/>
+    <w:pitch w:val="variable"/>
+    <w:sig w:usb0="00000000" w:usb1="10000000" w:usb2="00000000" w:usb3="00000000" w:csb0="80000000" w:csb1="00000000"/>
+  </w:font>
+  <w:font w:name="Liberation Sans">
+    <w:altName w:val="Arial"/>
+    <w:charset w:val="00"/>
+    <w:family w:val="swiss"/>
+    <w:pitch w:val="variable"/>
+  </w:font>
+  <w:font w:name="Noto Sans CJK SC">
+    <w:panose1 w:val="00000000000000000000"/>
+    <w:charset w:val="00"/>
+    <w:family w:val="roman"/>
+    <w:notTrueType/>
+    <w:pitch w:val="default"/>
+  </w:font>
+  <w:font w:name="Tahoma">
+    <w:panose1 w:val="020B0604030504040204"/>
+    <w:charset w:val="EE"/>
+    <w:family w:val="swiss"/>
+    <w:pitch w:val="variable"/>
+    <w:sig w:usb0="E1002EFF" w:usb1="C000605B" w:usb2="00000029" w:usb3="00000000" w:csb0="000101FF" w:csb1="00000000"/>
+  </w:font>
+</w:fonts>
+</file>
+
+<file path=word\footer1.xml><?xml version="1.0" encoding="utf-8"?>
 <w:ftr xmlns:wpc="http://schemas.microsoft.com/office/word/2010/wordprocessingCanvas" xmlns:cx="http://schemas.microsoft.com/office/drawing/2014/chartex" xmlns:cx1="http://schemas.microsoft.com/office/drawing/2015/9/8/chartex" xmlns:cx2="http://schemas.microsoft.com/office/drawing/2015/10/21/chartex" xmlns:cx3="http://schemas.microsoft.com/office/drawing/2016/5/9/chartex" xmlns:cx4="http://schemas.microsoft.com/office/drawing/2016/5/10/chartex" xmlns:cx5="http://schemas.microsoft.com/office/drawing/2016/5/11/chartex" xmlns:cx6="http://schemas.microsoft.com/office/drawing/2016/5/12/chartex" xmlns:cx7="http://schemas.microsoft.com/office/drawing/2016/5/13/chartex" xmlns:cx8="http://schemas.microsoft.com/office/drawing/2016/5/14/chartex" xmlns:mc="http://schemas.openxmlformats.org/markup-compatibility/2006" xmlns:aink="http://schemas.microsoft.com/office/drawing/2016/ink" xmlns:am3d="http://schemas.microsoft.com/office/drawing/2017/model3d" xmlns:o="urn:schemas-microsoft-com:office:office" xmlns:oel="http://schemas.microsoft.com/office/2019/extlst" xmlns:r="http://schemas.openxmlformats.org/officeDocument/2006/relationships" xmlns:m="http://schemas.openxmlformats.org/officeDocument/2006/math" xmlns:v="urn:schemas-microsoft-com:vml" xmlns:wp14="http://schemas.microsoft.com/office/word/2010/wordprocessingDrawing" xmlns:wp="http://schemas.openxmlformats.org/drawingml/2006/wordprocessingDrawing" xmlns:w10="urn:schemas-microsoft-com:office:word" xmlns:w="http://schemas.openxmlformats.org/wordprocessingml/2006/main" xmlns:w14="http://schemas.microsoft.com/office/word/2010/wordml" xmlns:w15="http://schemas.microsoft.com/office/word/2012/wordml" xmlns:w16cex="http://schemas.microsoft.com/office/word/2018/wordml/cex" xmlns:w16cid="http://schemas.microsoft.com/office/word/2016/wordml/cid" xmlns:w16="http://schemas.microsoft.com/office/word/2018/wordml" xmlns:w16du="http://schemas.microsoft.com/office/word/2023/wordml/word16du" xmlns:w16sdtdh="http://schemas.microsoft.com/office/word/2020/wordml/sdtdatahash" xmlns:w16sdtfl="http://schemas.microsoft.com/office/word/2024/wordml/sdtformatlock" xmlns:w16se="http://schemas.microsoft.com/office/word/2015/wordml/symex" xmlns:wpg="http://schemas.microsoft.com/office/word/2010/wordprocessingGroup" xmlns:wpi="http://schemas.microsoft.com/office/word/2010/wordprocessingInk" xmlns:wne="http://schemas.microsoft.com/office/word/2006/wordml" xmlns:wps="http://schemas.microsoft.com/office/word/2010/wordprocessingShape" mc:Ignorable="w14 w15 w16se w16cid w16 w16cex w16sdtdh w16sdtfl w16du wp14">
   <w:p>
     <w:pPr>
@@ -3179,7 +3313,7 @@
 </w:ftr>
 </file>
 
-<file path=word/footnotes.xml><?xml version="1.0" encoding="utf-8"?>
+<file path=word\footnotes.xml><?xml version="1.0" encoding="utf-8"?>
 <w:footnotes xmlns:wpc="http://schemas.microsoft.com/office/word/2010/wordprocessingCanvas" xmlns:cx="http://schemas.microsoft.com/office/drawing/2014/chartex" xmlns:cx1="http://schemas.microsoft.com/office/drawing/2015/9/8/chartex" xmlns:cx2="http://schemas.microsoft.com/office/drawing/2015/10/21/chartex" xmlns:cx3="http://schemas.microsoft.com/office/drawing/2016/5/9/chartex" xmlns:cx4="http://schemas.microsoft.com/office/drawing/2016/5/10/chartex" xmlns:cx5="http://schemas.microsoft.com/office/drawing/2016/5/11/chartex" xmlns:cx6="http://schemas.microsoft.com/office/drawing/2016/5/12/chartex" xmlns:cx7="http://schemas.microsoft.com/office/drawing/2016/5/13/chartex" xmlns:cx8="http://schemas.microsoft.com/office/drawing/2016/5/14/chartex" xmlns:mc="http://schemas.openxmlformats.org/markup-compatibility/2006" xmlns:aink="http://schemas.microsoft.com/office/drawing/2016/ink" xmlns:am3d="http://schemas.microsoft.com/office/drawing/2017/model3d" xmlns:o="urn:schemas-microsoft-com:office:office" xmlns:oel="http://schemas.microsoft.com/office/2019/extlst" xmlns:r="http://schemas.openxmlformats.org/officeDocument/2006/relationships" xmlns:m="http://schemas.openxmlformats.org/officeDocument/2006/math" xmlns:v="urn:schemas-microsoft-com:vml" xmlns:wp14="http://schemas.microsoft.com/office/word/2010/wordprocessingDrawing" xmlns:wp="http://schemas.openxmlformats.org/drawingml/2006/wordprocessingDrawing" xmlns:w10="urn:schemas-microsoft-com:office:word" xmlns:w="http://schemas.openxmlformats.org/wordprocessingml/2006/main" xmlns:w14="http://schemas.microsoft.com/office/word/2010/wordml" xmlns:w15="http://schemas.microsoft.com/office/word/2012/wordml" xmlns:w16cex="http://schemas.microsoft.com/office/word/2018/wordml/cex" xmlns:w16cid="http://schemas.microsoft.com/office/word/2016/wordml/cid" xmlns:w16="http://schemas.microsoft.com/office/word/2018/wordml" xmlns:w16du="http://schemas.microsoft.com/office/word/2023/wordml/word16du" xmlns:w16sdtdh="http://schemas.microsoft.com/office/word/2020/wordml/sdtdatahash" xmlns:w16sdtfl="http://schemas.microsoft.com/office/word/2024/wordml/sdtformatlock" xmlns:w16se="http://schemas.microsoft.com/office/word/2015/wordml/symex" xmlns:wpg="http://schemas.microsoft.com/office/word/2010/wordprocessingGroup" xmlns:wpi="http://schemas.microsoft.com/office/word/2010/wordprocessingInk" xmlns:wne="http://schemas.microsoft.com/office/word/2006/wordml" xmlns:wps="http://schemas.microsoft.com/office/word/2010/wordprocessingShape" mc:Ignorable="w14 w15 w16se w16cid w16 w16cex w16sdtdh w16sdtfl w16du wp14">
   <w:footnote w:type="separator" w:id="-1">
     <w:p>
@@ -3198,7 +3332,7 @@
 </w:footnotes>
 </file>
 
-<file path=word/header1.xml><?xml version="1.0" encoding="utf-8"?>
+<file path=word\header1.xml><?xml version="1.0" encoding="utf-8"?>
 <w:hdr xmlns:wpc="http://schemas.microsoft.com/office/word/2010/wordprocessingCanvas" xmlns:cx="http://schemas.microsoft.com/office/drawing/2014/chartex" xmlns:cx1="http://schemas.microsoft.com/office/drawing/2015/9/8/chartex" xmlns:cx2="http://schemas.microsoft.com/office/drawing/2015/10/21/chartex" xmlns:cx3="http://schemas.microsoft.com/office/drawing/2016/5/9/chartex" xmlns:cx4="http://schemas.microsoft.com/office/drawing/2016/5/10/chartex" xmlns:cx5="http://schemas.microsoft.com/office/drawing/2016/5/11/chartex" xmlns:cx6="http://schemas.microsoft.com/office/drawing/2016/5/12/chartex" xmlns:cx7="http://schemas.microsoft.com/office/drawing/2016/5/13/chartex" xmlns:cx8="http://schemas.microsoft.com/office/drawing/2016/5/14/chartex" xmlns:mc="http://schemas.openxmlformats.org/markup-compatibility/2006" xmlns:aink="http://schemas.microsoft.com/office/drawing/2016/ink" xmlns:am3d="http://schemas.microsoft.com/office/drawing/2017/model3d" xmlns:o="urn:schemas-microsoft-com:office:office" xmlns:oel="http://schemas.microsoft.com/office/2019/extlst" xmlns:r="http://schemas.openxmlformats.org/officeDocument/2006/relationships" xmlns:m="http://schemas.openxmlformats.org/officeDocument/2006/math" xmlns:v="urn:schemas-microsoft-com:vml" xmlns:wp14="http://schemas.microsoft.com/office/word/2010/wordprocessingDrawing" xmlns:wp="http://schemas.openxmlformats.org/drawingml/2006/wordprocessingDrawing" xmlns:w10="urn:schemas-microsoft-com:office:word" xmlns:w="http://schemas.openxmlformats.org/wordprocessingml/2006/main" xmlns:w14="http://schemas.microsoft.com/office/word/2010/wordml" xmlns:w15="http://schemas.microsoft.com/office/word/2012/wordml" xmlns:w16cex="http://schemas.microsoft.com/office/word/2018/wordml/cex" xmlns:w16cid="http://schemas.microsoft.com/office/word/2016/wordml/cid" xmlns:w16="http://schemas.microsoft.com/office/word/2018/wordml" xmlns:w16du="http://schemas.microsoft.com/office/word/2023/wordml/word16du" xmlns:w16sdtdh="http://schemas.microsoft.com/office/word/2020/wordml/sdtdatahash" xmlns:w16sdtfl="http://schemas.microsoft.com/office/word/2024/wordml/sdtformatlock" xmlns:w16se="http://schemas.microsoft.com/office/word/2015/wordml/symex" xmlns:wpg="http://schemas.microsoft.com/office/word/2010/wordprocessingGroup" xmlns:wpi="http://schemas.microsoft.com/office/word/2010/wordprocessingInk" xmlns:wne="http://schemas.microsoft.com/office/word/2006/wordml" xmlns:wps="http://schemas.microsoft.com/office/word/2010/wordprocessingShape" mc:Ignorable="w14 w15 w16se w16cid w16 w16cex w16sdtdh w16sdtfl w16du wp14">
   <w:p>
     <w:pPr>
@@ -3263,7 +3397,7 @@
 </w:hdr>
 </file>
 
-<file path=word/numbering.xml><?xml version="1.0" encoding="utf-8"?>
+<file path=word\numbering.xml><?xml version="1.0" encoding="utf-8"?>
 <w:numbering xmlns:wpc="http://schemas.microsoft.com/office/word/2010/wordprocessingCanvas" xmlns:cx="http://schemas.microsoft.com/office/drawing/2014/chartex" xmlns:cx1="http://schemas.microsoft.com/office/drawing/2015/9/8/chartex" xmlns:cx2="http://schemas.microsoft.com/office/drawing/2015/10/21/chartex" xmlns:cx3="http://schemas.microsoft.com/office/drawing/2016/5/9/chartex" xmlns:cx4="http://schemas.microsoft.com/office/drawing/2016/5/10/chartex" xmlns:cx5="http://schemas.microsoft.com/office/drawing/2016/5/11/chartex" xmlns:cx6="http://schemas.microsoft.com/office/drawing/2016/5/12/chartex" xmlns:cx7="http://schemas.microsoft.com/office/drawing/2016/5/13/chartex" xmlns:cx8="http://schemas.microsoft.com/office/drawing/2016/5/14/chartex" xmlns:mc="http://schemas.openxmlformats.org/markup-compatibility/2006" xmlns:aink="http://schemas.microsoft.com/office/drawing/2016/ink" xmlns:am3d="http://schemas.microsoft.com/office/drawing/2017/model3d" xmlns:o="urn:schemas-microsoft-com:office:office" xmlns:oel="http://schemas.microsoft.com/office/2019/extlst" xmlns:r="http://schemas.openxmlformats.org/officeDocument/2006/relationships" xmlns:m="http://schemas.openxmlformats.org/officeDocument/2006/math" xmlns:v="urn:schemas-microsoft-com:vml" xmlns:wp14="http://schemas.microsoft.com/office/word/2010/wordprocessingDrawing" xmlns:wp="http://schemas.openxmlformats.org/drawingml/2006/wordprocessingDrawing" xmlns:w10="urn:schemas-microsoft-com:office:word" xmlns:w="http://schemas.openxmlformats.org/wordprocessingml/2006/main" xmlns:w14="http://schemas.microsoft.com/office/word/2010/wordml" xmlns:w15="http://schemas.microsoft.com/office/word/2012/wordml" xmlns:w16cex="http://schemas.microsoft.com/office/word/2018/wordml/cex" xmlns:w16cid="http://schemas.microsoft.com/office/word/2016/wordml/cid" xmlns:w16="http://schemas.microsoft.com/office/word/2018/wordml" xmlns:w16du="http://schemas.microsoft.com/office/word/2023/wordml/word16du" xmlns:w16sdtdh="http://schemas.microsoft.com/office/word/2020/wordml/sdtdatahash" xmlns:w16sdtfl="http://schemas.microsoft.com/office/word/2024/wordml/sdtformatlock" xmlns:w16se="http://schemas.microsoft.com/office/word/2015/wordml/symex" xmlns:wpg="http://schemas.microsoft.com/office/word/2010/wordprocessingGroup" xmlns:wpi="http://schemas.microsoft.com/office/word/2010/wordprocessingInk" xmlns:wne="http://schemas.microsoft.com/office/word/2006/wordml" xmlns:wps="http://schemas.microsoft.com/office/word/2010/wordprocessingShape" mc:Ignorable="w14 w15 w16se w16cid w16 w16cex w16sdtdh w16sdtfl w16du wp14">
   <w:abstractNum w:abstractNumId="0" w15:restartNumberingAfterBreak="0">
     <w:nsid w:val="438F0956"/>
@@ -3393,7 +3527,66 @@
 </w:numbering>
 </file>
 
-<file path=word/styles.xml><?xml version="1.0" encoding="utf-8"?>
+<file path=word\settings.xml><?xml version="1.0" encoding="utf-8"?>
+<w:settings xmlns:mc="http://schemas.openxmlformats.org/markup-compatibility/2006" xmlns:o="urn:schemas-microsoft-com:office:office" xmlns:r="http://schemas.openxmlformats.org/officeDocument/2006/relationships" xmlns:m="http://schemas.openxmlformats.org/officeDocument/2006/math" xmlns:v="urn:schemas-microsoft-com:vml" xmlns:w10="urn:schemas-microsoft-com:office:word" xmlns:w="http://schemas.openxmlformats.org/wordprocessingml/2006/main" xmlns:w14="http://schemas.microsoft.com/office/word/2010/wordml" xmlns:w15="http://schemas.microsoft.com/office/word/2012/wordml" xmlns:w16cex="http://schemas.microsoft.com/office/word/2018/wordml/cex" xmlns:w16cid="http://schemas.microsoft.com/office/word/2016/wordml/cid" xmlns:w16="http://schemas.microsoft.com/office/word/2018/wordml" xmlns:w16du="http://schemas.microsoft.com/office/word/2023/wordml/word16du" xmlns:w16sdtdh="http://schemas.microsoft.com/office/word/2020/wordml/sdtdatahash" xmlns:w16sdtfl="http://schemas.microsoft.com/office/word/2024/wordml/sdtformatlock" xmlns:w16se="http://schemas.microsoft.com/office/word/2015/wordml/symex" xmlns:sl="http://schemas.openxmlformats.org/schemaLibrary/2006/main" mc:Ignorable="w14 w15 w16se w16cid w16 w16cex w16sdtdh w16sdtfl w16du">
+  <w:zoom w:percent="140"/>
+  <w:proofState w:spelling="clean" w:grammar="clean"/>
+  <w:defaultTabStop w:val="708"/>
+  <w:autoHyphenation/>
+  <w:hyphenationZone w:val="425"/>
+  <w:characterSpacingControl w:val="doNotCompress"/>
+  <w:footnotePr>
+    <w:footnote w:id="-1"/>
+    <w:footnote w:id="0"/>
+  </w:footnotePr>
+  <w:endnotePr>
+    <w:endnote w:id="-1"/>
+    <w:endnote w:id="0"/>
+  </w:endnotePr>
+  <w:compat>
+    <w:compatSetting w:name="compatibilityMode" w:uri="http://schemas.microsoft.com/office/word" w:val="15"/>
+    <w:compatSetting w:name="overrideTableStyleFontSizeAndJustification" w:uri="http://schemas.microsoft.com/office/word" w:val="1"/>
+    <w:compatSetting w:name="enableOpenTypeFeatures" w:uri="http://schemas.microsoft.com/office/word" w:val="1"/>
+    <w:compatSetting w:name="doNotFlipMirrorIndents" w:uri="http://schemas.microsoft.com/office/word" w:val="1"/>
+    <w:compatSetting w:name="differentiateMultirowTableHeaders" w:uri="http://schemas.microsoft.com/office/word" w:val="1"/>
+    <w:compatSetting w:name="useWord2013TrackBottomHyphenation" w:uri="http://schemas.microsoft.com/office/word" w:val="0"/>
+  </w:compat>
+  <w:rsids>
+    <w:rsidRoot w:val="00515083"/>
+    <w:rsid w:val="0004630E"/>
+    <w:rsid w:val="004E0E57"/>
+    <w:rsid w:val="00515083"/>
+    <w:rsid w:val="00A11568"/>
+  </w:rsids>
+  <m:mathPr>
+    <m:mathFont m:val="Cambria Math"/>
+    <m:brkBin m:val="before"/>
+    <m:brkBinSub m:val="--"/>
+    <m:smallFrac m:val="0"/>
+    <m:dispDef/>
+    <m:lMargin m:val="0"/>
+    <m:rMargin m:val="0"/>
+    <m:defJc m:val="centerGroup"/>
+    <m:wrapIndent m:val="1440"/>
+    <m:intLim m:val="subSup"/>
+    <m:naryLim m:val="undOvr"/>
+  </m:mathPr>
+  <w:themeFontLang w:val="sl-SI"/>
+  <w:clrSchemeMapping w:bg1="light1" w:t1="dark1" w:bg2="light2" w:t2="dark2" w:accent1="accent1" w:accent2="accent2" w:accent3="accent3" w:accent4="accent4" w:accent5="accent5" w:accent6="accent6" w:hyperlink="hyperlink" w:followedHyperlink="followedHyperlink"/>
+  <w:shapeDefaults>
+    <o:shapedefaults v:ext="edit" spidmax="1026"/>
+    <o:shapelayout v:ext="edit">
+      <o:idmap v:ext="edit" data="1"/>
+    </o:shapelayout>
+  </w:shapeDefaults>
+  <w:decimalSymbol w:val=","/>
+  <w:listSeparator w:val=";"/>
+  <w14:docId w14:val="11D1084B"/>
+  <w15:docId w15:val="{29732F96-8DF9-431B-B1EF-50F60428F160}"/>
+</w:settings>
+</file>
+
+<file path=word\styles.xml><?xml version="1.0" encoding="utf-8"?>
 <w:styles xmlns:mc="http://schemas.openxmlformats.org/markup-compatibility/2006" xmlns:r="http://schemas.openxmlformats.org/officeDocument/2006/relationships" xmlns:w="http://schemas.openxmlformats.org/wordprocessingml/2006/main" xmlns:w14="http://schemas.microsoft.com/office/word/2010/wordml" xmlns:w15="http://schemas.microsoft.com/office/word/2012/wordml" xmlns:w16cex="http://schemas.microsoft.com/office/word/2018/wordml/cex" xmlns:w16cid="http://schemas.microsoft.com/office/word/2016/wordml/cid" xmlns:w16="http://schemas.microsoft.com/office/word/2018/wordml" xmlns:w16du="http://schemas.microsoft.com/office/word/2023/wordml/word16du" xmlns:w16sdtdh="http://schemas.microsoft.com/office/word/2020/wordml/sdtdatahash" xmlns:w16sdtfl="http://schemas.microsoft.com/office/word/2024/wordml/sdtformatlock" xmlns:w16se="http://schemas.microsoft.com/office/word/2015/wordml/symex" mc:Ignorable="w14 w15 w16se w16cid w16 w16cex w16sdtdh w16sdtfl w16du">
   <w:docDefaults>
     <w:rPrDefault>
@@ -4413,7 +4606,7 @@
 </w:styles>
 </file>
 
-<file path=word/theme/theme1.xml><?xml version="1.0" encoding="utf-8"?>
+<file path=word\theme\theme1.xml><?xml version="1.0" encoding="utf-8"?>
 <a:theme xmlns:a="http://schemas.openxmlformats.org/drawingml/2006/main" name="Office">
   <a:themeElements>
     <a:clrScheme name="LibreOffice">
@@ -4519,4 +4712,8 @@
   <a:objectDefaults/>
   <a:extraClrSchemeLst/>
 </a:theme>
+</file>
+
+<file path=word\webSettings.xml><?xml version="1.0" encoding="utf-8"?>
+<w:webSettings xmlns:mc="http://schemas.openxmlformats.org/markup-compatibility/2006" xmlns:r="http://schemas.openxmlformats.org/officeDocument/2006/relationships" xmlns:w="http://schemas.openxmlformats.org/wordprocessingml/2006/main" xmlns:w14="http://schemas.microsoft.com/office/word/2010/wordml" xmlns:w15="http://schemas.microsoft.com/office/word/2012/wordml" xmlns:w16cex="http://schemas.microsoft.com/office/word/2018/wordml/cex" xmlns:w16cid="http://schemas.microsoft.com/office/word/2016/wordml/cid" xmlns:w16="http://schemas.microsoft.com/office/word/2018/wordml" xmlns:w16du="http://schemas.microsoft.com/office/word/2023/wordml/word16du" xmlns:w16sdtdh="http://schemas.microsoft.com/office/word/2020/wordml/sdtdatahash" xmlns:w16sdtfl="http://schemas.microsoft.com/office/word/2024/wordml/sdtformatlock" xmlns:w16se="http://schemas.microsoft.com/office/word/2015/wordml/symex" mc:Ignorable="w14 w15 w16se w16cid w16 w16cex w16sdtdh w16sdtfl w16du"/>
 </file>
</xml_diff>